<commit_message>
docs: record the repository and pipeline URLs
</commit_message>
<xml_diff>
--- a/docs/Work1_Report_SONG_Kongliang_23320316.docx
+++ b/docs/Work1_Report_SONG_Kongliang_23320316.docx
@@ -142,7 +142,7 @@
           <w:i w:val="0"/>
           <w:sz w:val="20"/>
         </w:rPr>
-        <w:t>Repository: &lt;public GitHub/GitLab URL&gt;</w:t>
+        <w:t>Repository: https://github.com/skl233/hdu-is-work1</w:t>
       </w:r>
     </w:p>
     <w:p>
@@ -156,7 +156,7 @@
           <w:i w:val="0"/>
           <w:sz w:val="20"/>
         </w:rPr>
-        <w:t>Pipeline run: &lt;Actions run URL&gt;</w:t>
+        <w:t>Pipeline run: https://github.com/skl233/hdu-is-work1/actions/runs/40266318401</w:t>
       </w:r>
     </w:p>
     <w:p>

</xml_diff>